<commit_message>
Document Twilio real-SMS OTP setup, exact S3 IAM console path, and expanded shipping list
Adds the enable-twilio config block (provider was already implemented),
the exact AWS Console click-path for the demo IAM user policy fix, real-SMS
sign-in steps, and a secrets warning for the office-laptop handover.

Generated with Codebuff 🤖
Co-Authored-By: Codebuff <noreply@codebuff.com>
</commit_message>
<xml_diff>
--- a/NetworkPeer-main/docs/LINUX_TOMORROW_QUICKSTART.docx
+++ b/NetworkPeer-main/docs/LINUX_TOMORROW_QUICKSTART.docx
@@ -283,7 +283,16 @@
     <w:p>
       <w:pPr/>
       <w:r>
-        <w:t xml:space="preserve">The demo IAM user is missing 3 actions and the docs had 2 wrong names. In AWS Console: IAM → Users → </w:t>
+        <w:t xml:space="preserve">The demo IAM user is missing 3 actions and the docs had 2 wrong names. </w:t>
+      </w:r>
+      <w:r>
+        <w:rPr>
+          <w:b/>
+        </w:rPr>
+        <w:t xml:space="preserve">Where to make the change:</w:t>
+      </w:r>
+      <w:r>
+        <w:t xml:space="preserve"> AWS Console → IAM → Users → </w:t>
       </w:r>
       <w:r>
         <w:rPr>
@@ -294,7 +303,54 @@
         <w:t xml:space="preserve">networkpeer-demo</w:t>
       </w:r>
       <w:r>
-        <w:t xml:space="preserve"> → Permissions → add/merge this policy (replace the bucket name if yours differs):</w:t>
+        <w:t xml:space="preserve"> → </w:t>
+      </w:r>
+      <w:r>
+        <w:rPr>
+          <w:b/>
+        </w:rPr>
+        <w:t xml:space="preserve">Permissions</w:t>
+      </w:r>
+      <w:r>
+        <w:t xml:space="preserve"> → </w:t>
+      </w:r>
+      <w:r>
+        <w:rPr>
+          <w:b/>
+        </w:rPr>
+        <w:t xml:space="preserve">Add permissions</w:t>
+      </w:r>
+      <w:r>
+        <w:t xml:space="preserve"> → </w:t>
+      </w:r>
+      <w:r>
+        <w:rPr>
+          <w:b/>
+        </w:rPr>
+        <w:t xml:space="preserve">Create inline policy</w:t>
+      </w:r>
+      <w:r>
+        <w:t xml:space="preserve"> → </w:t>
+      </w:r>
+      <w:r>
+        <w:rPr>
+          <w:b/>
+        </w:rPr>
+        <w:t xml:space="preserve">JSON</w:t>
+      </w:r>
+      <w:r>
+        <w:t xml:space="preserve"> tab → paste the policy below → Next → Create policy. (Can't be done from the Mac — no aws CLI, and this user can't edit its own policy. Bucket name is </w:t>
+      </w:r>
+      <w:r>
+        <w:rPr>
+          <w:rFonts w:ascii="Consolas" w:hAnsi="Consolas" w:cs="Consolas"/>
+          <w:shd w:val="clear" w:color="auto" w:fill="F2F2F2"/>
+          <w:sz w:val="18"/>
+        </w:rPr>
+        <w:t xml:space="preserve">networkpeer-v1</w:t>
+      </w:r>
+      <w:r>
+        <w:t xml:space="preserve">.)</w:t>
       </w:r>
     </w:p>
     <w:p>
@@ -787,7 +843,16 @@
     <w:p>
       <w:pPr/>
       <w:r>
-        <w:t xml:space="preserve">   The OTP is displayed on the verify screen (dev mode) — any phone number works.</w:t>
+        <w:t xml:space="preserve">   With Twilio on, the OTP arrives by </w:t>
+      </w:r>
+      <w:r>
+        <w:rPr>
+          <w:b/>
+        </w:rPr>
+        <w:t xml:space="preserve">real SMS</w:t>
+      </w:r>
+      <w:r>
+        <w:t xml:space="preserve"> (use numbers verified in the Twilio    console; trial accounts only send to verified numbers). Console mode shows it on the    verify screen instead.</w:t>
       </w:r>
     </w:p>
     <w:p>
@@ -1295,6 +1360,66 @@
       </w:r>
     </w:p>
     <w:p>
+      <w:pPr>
+        <w:pStyle w:val="ListParagraph"/>
+        <w:ind w:left="360"/>
+      </w:pPr>
+      <w:r>
+        <w:t xml:space="preserve">4.  Optional: this quickstart (</w:t>
+      </w:r>
+      <w:r>
+        <w:rPr>
+          <w:rFonts w:ascii="Consolas" w:hAnsi="Consolas" w:cs="Consolas"/>
+          <w:shd w:val="clear" w:color="auto" w:fill="F2F2F2"/>
+          <w:sz w:val="18"/>
+        </w:rPr>
+        <w:t xml:space="preserve">LINUX_TOMORROW_QUICKSTART.md</w:t>
+      </w:r>
+      <w:r>
+        <w:t xml:space="preserve"> / </w:t>
+      </w:r>
+      <w:r>
+        <w:rPr>
+          <w:rFonts w:ascii="Consolas" w:hAnsi="Consolas" w:cs="Consolas"/>
+          <w:shd w:val="clear" w:color="auto" w:fill="F2F2F2"/>
+          <w:sz w:val="18"/>
+        </w:rPr>
+        <w:t xml:space="preserve">.docx</w:t>
+      </w:r>
+      <w:r>
+        <w:t xml:space="preserve">) so they can follow</w:t>
+      </w:r>
+    </w:p>
+    <w:p>
+      <w:pPr/>
+      <w:r>
+        <w:t xml:space="preserve">   the demo script themselves.</w:t>
+      </w:r>
+    </w:p>
+    <w:p>
+      <w:pPr/>
+      <w:r>
+        <w:rPr>
+          <w:b/>
+        </w:rPr>
+        <w:t xml:space="preserve">Never ship secrets:</w:t>
+      </w:r>
+      <w:r>
+        <w:t xml:space="preserve"> Twilio SID/token, AWS keys, and </w:t>
+      </w:r>
+      <w:r>
+        <w:rPr>
+          <w:rFonts w:ascii="Consolas" w:hAnsi="Consolas" w:cs="Consolas"/>
+          <w:shd w:val="clear" w:color="auto" w:fill="F2F2F2"/>
+          <w:sz w:val="18"/>
+        </w:rPr>
+        <w:t xml:space="preserve">.env</w:t>
+      </w:r>
+      <w:r>
+        <w:t xml:space="preserve"> stay on the Mac (or in the cloud platform's env vars for Path B) — the office laptop only ever opens URLs.</w:t>
+      </w:r>
+    </w:p>
+    <w:p>
       <w:pPr/>
       <w:r>
         <w:rPr>
@@ -1541,7 +1666,7 @@
     <w:p>
       <w:pPr/>
       <w:r>
-        <w:t xml:space="preserve">Known limits to be honest about: admin screens are prototypes; browser push (FCM) isn't wired; cloud login would need Twilio (dev OTP echo is what makes this demo work).</w:t>
+        <w:t xml:space="preserve">Known limits to be honest about: admin screens are prototypes; browser push (FCM) isn't wired. OTP is real SMS via Twilio (trial accounts only deliver to verified numbers); in console mode it's echoed on the verify screen instead.</w:t>
       </w:r>
     </w:p>
     <w:sectPr>

</xml_diff>